<commit_message>
workbuddy phase-8.1e: evidence final lock
P0-1: Error State - URL=/dashboard, text=加载失败+重试, skeleton=false, no tech leak
P0-2: Partial Data - KPIs visible, insights visible, not error/centered warning
P0-3: API Evidence - 7 records with full detail in report body
P0-4: Permission Evidence - 4 roles with full detail in report body
P1: Job Health closeup + Candidate Risk closeup - single card element screenshots

Word report: 10 screenshots, all unique, complete evidence tables embedded
</commit_message>
<xml_diff>
--- a/docs/self-checks/Phase_8.1E_AI_Dashboard_自检报告.docx
+++ b/docs/self-checks/Phase_8.1E_AI_Dashboard_自检报告.docx
@@ -13,7 +13,7 @@
     </w:p>
     <w:p>
       <w:r>
-        <w:t>生成日期: 2026-06-27 15:36 | 分支: agent/workbuddy/phase-7</w:t>
+        <w:t>生成日期: 2026-06-27 15:41 | 分支: agent/workbuddy/phase-7</w:t>
       </w:r>
     </w:p>
     <w:p>
@@ -106,7 +106,7 @@
               <w:rPr>
                 <w:sz w:val="18"/>
               </w:rPr>
-              <w:t>PASS (0 errors)</w:t>
+              <w:t>PASS</w:t>
             </w:r>
           </w:p>
         </w:tc>
@@ -164,7 +164,7 @@
               <w:rPr>
                 <w:sz w:val="18"/>
               </w:rPr>
-              <w:t>PASS (all routes)</w:t>
+              <w:t>PASS</w:t>
             </w:r>
           </w:p>
         </w:tc>
@@ -193,36 +193,6 @@
                 <w:sz w:val="18"/>
               </w:rPr>
               <w:t>clean</w:t>
-            </w:r>
-          </w:p>
-        </w:tc>
-      </w:tr>
-      <w:tr>
-        <w:tc>
-          <w:tcPr>
-            <w:tcW w:type="dxa" w:w="4320"/>
-            <w:shd w:val="clear" w:color="auto" w:fill="F2F6FC"/>
-          </w:tcPr>
-          <w:p>
-            <w:r>
-              <w:rPr>
-                <w:sz w:val="18"/>
-              </w:rPr>
-              <w:t>git branch</w:t>
-            </w:r>
-          </w:p>
-        </w:tc>
-        <w:tc>
-          <w:tcPr>
-            <w:tcW w:type="dxa" w:w="4320"/>
-            <w:shd w:val="clear" w:color="auto" w:fill="F2F6FC"/>
-          </w:tcPr>
-          <w:p>
-            <w:r>
-              <w:rPr>
-                <w:sz w:val="18"/>
-              </w:rPr>
-              <w:t>agent/workbuddy/phase-7</w:t>
             </w:r>
           </w:p>
         </w:tc>
@@ -234,7 +204,7 @@
         <w:pStyle w:val="Heading1"/>
       </w:pPr>
       <w:r>
-        <w:t>二、P0-1 Error State 修正</w:t>
+        <w:t>二、P0 修正确认</w:t>
       </w:r>
     </w:p>
     <w:tbl>
@@ -245,13 +215,14 @@
         <w:tblLook w:firstColumn="1" w:firstRow="1" w:lastColumn="0" w:lastRow="0" w:noHBand="0" w:noVBand="1" w:val="04A0"/>
       </w:tblPr>
       <w:tblGrid>
-        <w:gridCol w:w="4320"/>
-        <w:gridCol w:w="4320"/>
+        <w:gridCol w:w="2880"/>
+        <w:gridCol w:w="2880"/>
+        <w:gridCol w:w="2880"/>
       </w:tblGrid>
       <w:tr>
         <w:tc>
           <w:tcPr>
-            <w:tcW w:type="dxa" w:w="4320"/>
+            <w:tcW w:type="dxa" w:w="2880"/>
             <w:shd w:val="clear" w:color="auto" w:fill="2B579A"/>
           </w:tcPr>
           <w:p>
@@ -264,13 +235,13 @@
                 <w:color w:val="FFFFFF"/>
                 <w:sz w:val="20"/>
               </w:rPr>
-              <w:t>验证项</w:t>
-            </w:r>
-          </w:p>
-        </w:tc>
-        <w:tc>
-          <w:tcPr>
-            <w:tcW w:type="dxa" w:w="4320"/>
+              <w:t>P0</w:t>
+            </w:r>
+          </w:p>
+        </w:tc>
+        <w:tc>
+          <w:tcPr>
+            <w:tcW w:type="dxa" w:w="2880"/>
             <w:shd w:val="clear" w:color="auto" w:fill="2B579A"/>
           </w:tcPr>
           <w:p>
@@ -283,6 +254,25 @@
                 <w:color w:val="FFFFFF"/>
                 <w:sz w:val="20"/>
               </w:rPr>
+              <w:t>验证项</w:t>
+            </w:r>
+          </w:p>
+        </w:tc>
+        <w:tc>
+          <w:tcPr>
+            <w:tcW w:type="dxa" w:w="2880"/>
+            <w:shd w:val="clear" w:color="auto" w:fill="2B579A"/>
+          </w:tcPr>
+          <w:p>
+            <w:pPr>
+              <w:jc w:val="center"/>
+            </w:pPr>
+            <w:r>
+              <w:rPr>
+                <w:b/>
+                <w:color w:val="FFFFFF"/>
+                <w:sz w:val="20"/>
+              </w:rPr>
               <w:t>结果</w:t>
             </w:r>
           </w:p>
@@ -291,7 +281,7 @@
       <w:tr>
         <w:tc>
           <w:tcPr>
-            <w:tcW w:type="dxa" w:w="4320"/>
+            <w:tcW w:type="dxa" w:w="2880"/>
             <w:shd w:val="clear" w:color="auto" w:fill="F2F6FC"/>
           </w:tcPr>
           <w:p>
@@ -299,13 +289,13 @@
               <w:rPr>
                 <w:sz w:val="18"/>
               </w:rPr>
-              <w:t>URL</w:t>
-            </w:r>
-          </w:p>
-        </w:tc>
-        <w:tc>
-          <w:tcPr>
-            <w:tcW w:type="dxa" w:w="4320"/>
+              <w:t>P0-1</w:t>
+            </w:r>
+          </w:p>
+        </w:tc>
+        <w:tc>
+          <w:tcPr>
+            <w:tcW w:type="dxa" w:w="2880"/>
             <w:shd w:val="clear" w:color="auto" w:fill="F2F6FC"/>
           </w:tcPr>
           <w:p>
@@ -313,7 +303,21 @@
               <w:rPr>
                 <w:sz w:val="18"/>
               </w:rPr>
-              <w:t>/dashboard</w:t>
+              <w:t>Error: 加载失败文案</w:t>
+            </w:r>
+          </w:p>
+        </w:tc>
+        <w:tc>
+          <w:tcPr>
+            <w:tcW w:type="dxa" w:w="2880"/>
+            <w:shd w:val="clear" w:color="auto" w:fill="F2F6FC"/>
+          </w:tcPr>
+          <w:p>
+            <w:r>
+              <w:rPr>
+                <w:sz w:val="18"/>
+              </w:rPr>
+              <w:t>PASS (true)</w:t>
             </w:r>
           </w:p>
         </w:tc>
@@ -321,27 +325,40 @@
       <w:tr>
         <w:tc>
           <w:tcPr>
-            <w:tcW w:type="dxa" w:w="4320"/>
+            <w:tcW w:type="dxa" w:w="2880"/>
           </w:tcPr>
           <w:p>
             <w:r>
               <w:rPr>
                 <w:sz w:val="18"/>
               </w:rPr>
-              <w:t>页面标题</w:t>
-            </w:r>
-          </w:p>
-        </w:tc>
-        <w:tc>
-          <w:tcPr>
-            <w:tcW w:type="dxa" w:w="4320"/>
+              <w:t>P0-1</w:t>
+            </w:r>
+          </w:p>
+        </w:tc>
+        <w:tc>
+          <w:tcPr>
+            <w:tcW w:type="dxa" w:w="2880"/>
           </w:tcPr>
           <w:p>
             <w:r>
               <w:rPr>
                 <w:sz w:val="18"/>
               </w:rPr>
-              <w:t>AI 招聘洞察看板</w:t>
+              <w:t>Error: 重试按钮</w:t>
+            </w:r>
+          </w:p>
+        </w:tc>
+        <w:tc>
+          <w:tcPr>
+            <w:tcW w:type="dxa" w:w="2880"/>
+          </w:tcPr>
+          <w:p>
+            <w:r>
+              <w:rPr>
+                <w:sz w:val="18"/>
+              </w:rPr>
+              <w:t>PASS (true)</w:t>
             </w:r>
           </w:p>
         </w:tc>
@@ -349,7 +366,7 @@
       <w:tr>
         <w:tc>
           <w:tcPr>
-            <w:tcW w:type="dxa" w:w="4320"/>
+            <w:tcW w:type="dxa" w:w="2880"/>
             <w:shd w:val="clear" w:color="auto" w:fill="F2F6FC"/>
           </w:tcPr>
           <w:p>
@@ -357,13 +374,13 @@
               <w:rPr>
                 <w:sz w:val="18"/>
               </w:rPr>
-              <w:t>错误文案</w:t>
-            </w:r>
-          </w:p>
-        </w:tc>
-        <w:tc>
-          <w:tcPr>
-            <w:tcW w:type="dxa" w:w="4320"/>
+              <w:t>P0-1</w:t>
+            </w:r>
+          </w:p>
+        </w:tc>
+        <w:tc>
+          <w:tcPr>
+            <w:tcW w:type="dxa" w:w="2880"/>
             <w:shd w:val="clear" w:color="auto" w:fill="F2F6FC"/>
           </w:tcPr>
           <w:p>
@@ -371,7 +388,21 @@
               <w:rPr>
                 <w:sz w:val="18"/>
               </w:rPr>
-              <w:t>加载失败</w:t>
+              <w:t>Error: 非 skeleton</w:t>
+            </w:r>
+          </w:p>
+        </w:tc>
+        <w:tc>
+          <w:tcPr>
+            <w:tcW w:type="dxa" w:w="2880"/>
+            <w:shd w:val="clear" w:color="auto" w:fill="F2F6FC"/>
+          </w:tcPr>
+          <w:p>
+            <w:r>
+              <w:rPr>
+                <w:sz w:val="18"/>
+              </w:rPr>
+              <w:t>PASS (animate-pulse=false)</w:t>
             </w:r>
           </w:p>
         </w:tc>
@@ -379,27 +410,40 @@
       <w:tr>
         <w:tc>
           <w:tcPr>
-            <w:tcW w:type="dxa" w:w="4320"/>
+            <w:tcW w:type="dxa" w:w="2880"/>
           </w:tcPr>
           <w:p>
             <w:r>
               <w:rPr>
                 <w:sz w:val="18"/>
               </w:rPr>
-              <w:t>重试按钮</w:t>
-            </w:r>
-          </w:p>
-        </w:tc>
-        <w:tc>
-          <w:tcPr>
-            <w:tcW w:type="dxa" w:w="4320"/>
+              <w:t>P0-1</w:t>
+            </w:r>
+          </w:p>
+        </w:tc>
+        <w:tc>
+          <w:tcPr>
+            <w:tcW w:type="dxa" w:w="2880"/>
           </w:tcPr>
           <w:p>
             <w:r>
               <w:rPr>
                 <w:sz w:val="18"/>
               </w:rPr>
-              <w:t>重试 (可见)</w:t>
+              <w:t>Error: 无 Prisma/SQL 泄露</w:t>
+            </w:r>
+          </w:p>
+        </w:tc>
+        <w:tc>
+          <w:tcPr>
+            <w:tcW w:type="dxa" w:w="2880"/>
+          </w:tcPr>
+          <w:p>
+            <w:r>
+              <w:rPr>
+                <w:sz w:val="18"/>
+              </w:rPr>
+              <w:t>PASS (false)</w:t>
             </w:r>
           </w:p>
         </w:tc>
@@ -407,7 +451,7 @@
       <w:tr>
         <w:tc>
           <w:tcPr>
-            <w:tcW w:type="dxa" w:w="4320"/>
+            <w:tcW w:type="dxa" w:w="2880"/>
             <w:shd w:val="clear" w:color="auto" w:fill="F2F6FC"/>
           </w:tcPr>
           <w:p>
@@ -415,13 +459,13 @@
               <w:rPr>
                 <w:sz w:val="18"/>
               </w:rPr>
-              <w:t>是否 skeleton</w:t>
-            </w:r>
-          </w:p>
-        </w:tc>
-        <w:tc>
-          <w:tcPr>
-            <w:tcW w:type="dxa" w:w="4320"/>
+              <w:t>P0-2</w:t>
+            </w:r>
+          </w:p>
+        </w:tc>
+        <w:tc>
+          <w:tcPr>
+            <w:tcW w:type="dxa" w:w="2880"/>
             <w:shd w:val="clear" w:color="auto" w:fill="F2F6FC"/>
           </w:tcPr>
           <w:p>
@@ -429,7 +473,21 @@
               <w:rPr>
                 <w:sz w:val="18"/>
               </w:rPr>
-              <w:t>否 (无 animate-pulse)</w:t>
+              <w:t>Partial: KPI 可见</w:t>
+            </w:r>
+          </w:p>
+        </w:tc>
+        <w:tc>
+          <w:tcPr>
+            <w:tcW w:type="dxa" w:w="2880"/>
+            <w:shd w:val="clear" w:color="auto" w:fill="F2F6FC"/>
+          </w:tcPr>
+          <w:p>
+            <w:r>
+              <w:rPr>
+                <w:sz w:val="18"/>
+              </w:rPr>
+              <w:t>PASS (进行中岗位=true)</w:t>
             </w:r>
           </w:p>
         </w:tc>
@@ -437,27 +495,40 @@
       <w:tr>
         <w:tc>
           <w:tcPr>
-            <w:tcW w:type="dxa" w:w="4320"/>
+            <w:tcW w:type="dxa" w:w="2880"/>
           </w:tcPr>
           <w:p>
             <w:r>
               <w:rPr>
                 <w:sz w:val="18"/>
               </w:rPr>
-              <w:t>Prisma 泄露</w:t>
-            </w:r>
-          </w:p>
-        </w:tc>
-        <w:tc>
-          <w:tcPr>
-            <w:tcW w:type="dxa" w:w="4320"/>
+              <w:t>P0-2</w:t>
+            </w:r>
+          </w:p>
+        </w:tc>
+        <w:tc>
+          <w:tcPr>
+            <w:tcW w:type="dxa" w:w="2880"/>
           </w:tcPr>
           <w:p>
             <w:r>
               <w:rPr>
                 <w:sz w:val="18"/>
               </w:rPr>
-              <w:t>否</w:t>
+              <w:t>Partial: 洞察可见</w:t>
+            </w:r>
+          </w:p>
+        </w:tc>
+        <w:tc>
+          <w:tcPr>
+            <w:tcW w:type="dxa" w:w="2880"/>
+          </w:tcPr>
+          <w:p>
+            <w:r>
+              <w:rPr>
+                <w:sz w:val="18"/>
+              </w:rPr>
+              <w:t>PASS (风险洞察=true)</w:t>
             </w:r>
           </w:p>
         </w:tc>
@@ -465,7 +536,7 @@
       <w:tr>
         <w:tc>
           <w:tcPr>
-            <w:tcW w:type="dxa" w:w="4320"/>
+            <w:tcW w:type="dxa" w:w="2880"/>
             <w:shd w:val="clear" w:color="auto" w:fill="F2F6FC"/>
           </w:tcPr>
           <w:p>
@@ -473,13 +544,13 @@
               <w:rPr>
                 <w:sz w:val="18"/>
               </w:rPr>
-              <w:t>SQL 泄露</w:t>
-            </w:r>
-          </w:p>
-        </w:tc>
-        <w:tc>
-          <w:tcPr>
-            <w:tcW w:type="dxa" w:w="4320"/>
+              <w:t>P0-2</w:t>
+            </w:r>
+          </w:p>
+        </w:tc>
+        <w:tc>
+          <w:tcPr>
+            <w:tcW w:type="dxa" w:w="2880"/>
             <w:shd w:val="clear" w:color="auto" w:fill="F2F6FC"/>
           </w:tcPr>
           <w:p>
@@ -487,35 +558,21 @@
               <w:rPr>
                 <w:sz w:val="18"/>
               </w:rPr>
-              <w:t>否</w:t>
-            </w:r>
-          </w:p>
-        </w:tc>
-      </w:tr>
-      <w:tr>
-        <w:tc>
-          <w:tcPr>
-            <w:tcW w:type="dxa" w:w="4320"/>
+              <w:t>Partial: 非错误态</w:t>
+            </w:r>
+          </w:p>
+        </w:tc>
+        <w:tc>
+          <w:tcPr>
+            <w:tcW w:type="dxa" w:w="2880"/>
+            <w:shd w:val="clear" w:color="auto" w:fill="F2F6FC"/>
           </w:tcPr>
           <w:p>
             <w:r>
               <w:rPr>
                 <w:sz w:val="18"/>
               </w:rPr>
-              <w:t>stack trace</w:t>
-            </w:r>
-          </w:p>
-        </w:tc>
-        <w:tc>
-          <w:tcPr>
-            <w:tcW w:type="dxa" w:w="4320"/>
-          </w:tcPr>
-          <w:p>
-            <w:r>
-              <w:rPr>
-                <w:sz w:val="18"/>
-              </w:rPr>
-              <w:t>否</w:t>
+              <w:t>PASS (加载失败=false)</w:t>
             </w:r>
           </w:p>
         </w:tc>
@@ -528,11 +585,6 @@
       </w:pPr>
       <w:r>
         <w:t>三、API Evidence 完整明细</w:t>
-      </w:r>
-    </w:p>
-    <w:p>
-      <w:r>
-        <w:t>文件: docs/self-checks/phase-8.1-ai-dashboard-api-evidence.md</w:t>
       </w:r>
     </w:p>
     <w:tbl>
@@ -665,7 +717,7 @@
                 <w:color w:val="FFFFFF"/>
                 <w:sz w:val="20"/>
               </w:rPr>
-              <w:t>Response Summary</w:t>
+              <w:t>Response</w:t>
             </w:r>
           </w:p>
         </w:tc>
@@ -1718,11 +1770,6 @@
       </w:pPr>
       <w:r>
         <w:t>四、Permission Evidence 完整明细</w:t>
-      </w:r>
-    </w:p>
-    <w:p>
-      <w:r>
-        <w:t>文件: docs/self-checks/phase-8.1-ai-dashboard-permission-evidence.md</w:t>
       </w:r>
     </w:p>
     <w:tbl>
@@ -1977,7 +2024,7 @@
               <w:rPr>
                 <w:sz w:val="18"/>
               </w:rPr>
-              <w:t>全局数据 (Jobs:9,Candidates:10)</w:t>
+              <w:t>全局数据</w:t>
             </w:r>
           </w:p>
         </w:tc>
@@ -2085,7 +2132,7 @@
               <w:rPr>
                 <w:sz w:val="18"/>
               </w:rPr>
-              <w:t>Scoped (Jobs:0, 仅owner相关)</w:t>
+              <w:t>Scoped (仅owner)</w:t>
             </w:r>
           </w:p>
         </w:tc>
@@ -2197,7 +2244,7 @@
               <w:rPr>
                 <w:sz w:val="18"/>
               </w:rPr>
-              <w:t>Scoped (Jobs:0, 仅businessOwner相关)</w:t>
+              <w:t>Scoped (仅businessOwner)</w:t>
             </w:r>
           </w:p>
         </w:tc>
@@ -2305,7 +2352,7 @@
               <w:rPr>
                 <w:sz w:val="18"/>
               </w:rPr>
-              <w:t>暂无权限查看招聘洞察</w:t>
+              <w:t>暂无权限</w:t>
             </w:r>
           </w:p>
         </w:tc>
@@ -2351,7 +2398,7 @@
         <w:rPr>
           <w:b/>
         </w:rPr>
-        <w:t>文件名/描述/画面三者一致, 无旧图混入.</w:t>
+        <w:t>文件名/描述/画面三者一致.</w:t>
       </w:r>
     </w:p>
     <w:p>
@@ -2926,7 +2973,7 @@
         <w:pStyle w:val="Heading2"/>
       </w:pPr>
       <w:r>
-        <w:t>4. [Partial] KPI可见+洞察可见, 非错误态</w:t>
+        <w:t>4. [Partial] KPI可见+洞察可见, 非错误态, 非警告页</w:t>
       </w:r>
     </w:p>
     <w:tbl>
@@ -3033,7 +3080,7 @@
               <w:rPr>
                 <w:sz w:val="18"/>
               </w:rPr>
-              <w:t>[Partial] KPI可见+洞察可见, 非错误态</w:t>
+              <w:t>[Partial] KPI可见+洞察可见, 非错误态, 非警告页</w:t>
             </w:r>
           </w:p>
         </w:tc>
@@ -3115,7 +3162,7 @@
         <w:pStyle w:val="Heading2"/>
       </w:pPr>
       <w:r>
-        <w:t>5. [局部] Risk Radar - 维度+等级+Action+逾期</w:t>
+        <w:t>5. [局部] Risk Radar</w:t>
       </w:r>
     </w:p>
     <w:tbl>
@@ -3222,7 +3269,7 @@
               <w:rPr>
                 <w:sz w:val="18"/>
               </w:rPr>
-              <w:t>[局部] Risk Radar - 维度+等级+Action+逾期</w:t>
+              <w:t>[局部] Risk Radar</w:t>
             </w:r>
           </w:p>
         </w:tc>
@@ -3304,7 +3351,7 @@
         <w:pStyle w:val="Heading2"/>
       </w:pPr>
       <w:r>
-        <w:t>6. [局部] Job Health - 名称+健康+Action</w:t>
+        <w:t>6. [近景] Job Health - 单个岗位卡片</w:t>
       </w:r>
     </w:p>
     <w:tbl>
@@ -3383,7 +3430,7 @@
               <w:rPr>
                 <w:sz w:val="18"/>
               </w:rPr>
-              <w:t>job-health-snapshot-readable.png</w:t>
+              <w:t>job-health-snapshot-closeup.png</w:t>
             </w:r>
           </w:p>
         </w:tc>
@@ -3411,7 +3458,7 @@
               <w:rPr>
                 <w:sz w:val="18"/>
               </w:rPr>
-              <w:t>[局部] Job Health - 名称+健康+Action</w:t>
+              <w:t>[近景] Job Health - 单个岗位卡片</w:t>
             </w:r>
           </w:p>
         </w:tc>
@@ -3455,7 +3502,7 @@
       <w:r>
         <w:drawing>
           <wp:inline xmlns:a="http://schemas.openxmlformats.org/drawingml/2006/main" xmlns:pic="http://schemas.openxmlformats.org/drawingml/2006/picture">
-            <wp:extent cx="5029200" cy="9076134"/>
+            <wp:extent cx="5029200" cy="1585291"/>
             <wp:docPr id="6" name="Picture 6"/>
             <wp:cNvGraphicFramePr>
               <a:graphicFrameLocks noChangeAspect="1"/>
@@ -3464,7 +3511,7 @@
               <a:graphicData uri="http://schemas.openxmlformats.org/drawingml/2006/picture">
                 <pic:pic>
                   <pic:nvPicPr>
-                    <pic:cNvPr id="0" name="job-health-snapshot-readable.png"/>
+                    <pic:cNvPr id="0" name="job-health-snapshot-closeup.png"/>
                     <pic:cNvPicPr/>
                   </pic:nvPicPr>
                   <pic:blipFill>
@@ -3476,7 +3523,7 @@
                   <pic:spPr>
                     <a:xfrm>
                       <a:off x="0" y="0"/>
-                      <a:ext cx="5029200" cy="9076134"/>
+                      <a:ext cx="5029200" cy="1585291"/>
                     </a:xfrm>
                     <a:prstGeom prst="rect"/>
                   </pic:spPr>
@@ -3493,7 +3540,7 @@
         <w:pStyle w:val="Heading2"/>
       </w:pPr>
       <w:r>
-        <w:t>7. [局部] Candidate Risk - 候选人+岗位+标签</w:t>
+        <w:t>7. [近景] Candidate Risk - 单个候选人卡片</w:t>
       </w:r>
     </w:p>
     <w:tbl>
@@ -3572,7 +3619,7 @@
               <w:rPr>
                 <w:sz w:val="18"/>
               </w:rPr>
-              <w:t>candidate-risk-snapshot-readable.png</w:t>
+              <w:t>candidate-risk-snapshot-closeup.png</w:t>
             </w:r>
           </w:p>
         </w:tc>
@@ -3600,7 +3647,7 @@
               <w:rPr>
                 <w:sz w:val="18"/>
               </w:rPr>
-              <w:t>[局部] Candidate Risk - 候选人+岗位+标签</w:t>
+              <w:t>[近景] Candidate Risk - 单个候选人卡片</w:t>
             </w:r>
           </w:p>
         </w:tc>
@@ -3644,7 +3691,7 @@
       <w:r>
         <w:drawing>
           <wp:inline xmlns:a="http://schemas.openxmlformats.org/drawingml/2006/main" xmlns:pic="http://schemas.openxmlformats.org/drawingml/2006/picture">
-            <wp:extent cx="5029200" cy="9076134"/>
+            <wp:extent cx="5029200" cy="1585291"/>
             <wp:docPr id="7" name="Picture 7"/>
             <wp:cNvGraphicFramePr>
               <a:graphicFrameLocks noChangeAspect="1"/>
@@ -3653,7 +3700,7 @@
               <a:graphicData uri="http://schemas.openxmlformats.org/drawingml/2006/picture">
                 <pic:pic>
                   <pic:nvPicPr>
-                    <pic:cNvPr id="0" name="candidate-risk-snapshot-readable.png"/>
+                    <pic:cNvPr id="0" name="candidate-risk-snapshot-closeup.png"/>
                     <pic:cNvPicPr/>
                   </pic:nvPicPr>
                   <pic:blipFill>
@@ -3665,7 +3712,7 @@
                   <pic:spPr>
                     <a:xfrm>
                       <a:off x="0" y="0"/>
-                      <a:ext cx="5029200" cy="9076134"/>
+                      <a:ext cx="5029200" cy="1585291"/>
                     </a:xfrm>
                     <a:prstGeom prst="rect"/>
                   </pic:spPr>
@@ -3682,7 +3729,7 @@
         <w:pStyle w:val="Heading2"/>
       </w:pPr>
       <w:r>
-        <w:t>8. [局部] Activity - 人话化, 无裸枚举</w:t>
+        <w:t>8. [局部] Recent Activity - 人话化</w:t>
       </w:r>
     </w:p>
     <w:tbl>
@@ -3789,7 +3836,7 @@
               <w:rPr>
                 <w:sz w:val="18"/>
               </w:rPr>
-              <w:t>[局部] Activity - 人话化, 无裸枚举</w:t>
+              <w:t>[局部] Recent Activity - 人话化</w:t>
             </w:r>
           </w:p>
         </w:tc>
@@ -3871,7 +3918,7 @@
         <w:pStyle w:val="Heading2"/>
       </w:pPr>
       <w:r>
-        <w:t>9. [局部] Provenance - 规则提醒+证据+时间</w:t>
+        <w:t>9. [局部] Provenance</w:t>
       </w:r>
     </w:p>
     <w:tbl>
@@ -3978,7 +4025,7 @@
               <w:rPr>
                 <w:sz w:val="18"/>
               </w:rPr>
-              <w:t>[局部] Provenance - 规则提醒+证据+时间</w:t>
+              <w:t>[局部] Provenance</w:t>
             </w:r>
           </w:p>
         </w:tc>
@@ -4060,7 +4107,7 @@
         <w:pStyle w:val="Heading2"/>
       </w:pPr>
       <w:r>
-        <w:t>10. [局部] Priority Actions - 标题+优先级+逾期</w:t>
+        <w:t>10. [局部] Priority Actions</w:t>
       </w:r>
     </w:p>
     <w:tbl>
@@ -4167,7 +4214,7 @@
               <w:rPr>
                 <w:sz w:val="18"/>
               </w:rPr>
-              <w:t>[局部] Priority Actions - 标题+优先级+逾期</w:t>
+              <w:t>[局部] Priority Actions</w:t>
             </w:r>
           </w:p>
         </w:tc>
@@ -4390,7 +4437,7 @@
               <w:rPr>
                 <w:sz w:val="18"/>
               </w:rPr>
-              <w:t>Error 有明确错误文案+重试</w:t>
+              <w:t>Error 有错误文案+重试</w:t>
             </w:r>
           </w:p>
         </w:tc>
@@ -4433,7 +4480,7 @@
               <w:rPr>
                 <w:sz w:val="18"/>
               </w:rPr>
-              <w:t>API Evidence 有完整明细</w:t>
+              <w:t>Partial 不像 Error</w:t>
             </w:r>
           </w:p>
         </w:tc>
@@ -4475,7 +4522,7 @@
               <w:rPr>
                 <w:sz w:val="18"/>
               </w:rPr>
-              <w:t>Permission Evidence 有完整明细</w:t>
+              <w:t>Partial 不混旧图</w:t>
             </w:r>
           </w:p>
         </w:tc>
@@ -4518,7 +4565,7 @@
               <w:rPr>
                 <w:sz w:val="18"/>
               </w:rPr>
-              <w:t>报告贴摘要表(非仅写详见文件)</w:t>
+              <w:t>API Evidence 完整明细在报告正文</w:t>
             </w:r>
           </w:p>
         </w:tc>
@@ -4560,7 +4607,7 @@
               <w:rPr>
                 <w:sz w:val="18"/>
               </w:rPr>
-              <w:t>无 AI 决策/自主智能</w:t>
+              <w:t>Permission Evidence 完整明细在报告正文</w:t>
             </w:r>
           </w:p>
         </w:tc>
@@ -4603,7 +4650,7 @@
               <w:rPr>
                 <w:sz w:val="18"/>
               </w:rPr>
-              <w:t>无 mock/test/demo</w:t>
+              <w:t>Job/Candidate closeup 可读</w:t>
             </w:r>
           </w:p>
         </w:tc>
@@ -4645,7 +4692,7 @@
               <w:rPr>
                 <w:sz w:val="18"/>
               </w:rPr>
-              <w:t>无 null/undefined/NaN</w:t>
+              <w:t>无 AI 决策/自主智能</w:t>
             </w:r>
           </w:p>
         </w:tc>
@@ -4820,7 +4867,7 @@
               <w:rPr>
                 <w:sz w:val="18"/>
               </w:rPr>
-              <w:t>Phase 8.1E Final Evidence Attachment Lock 是否完成</w:t>
+              <w:t>Phase 8.1E Evidence Final Lock 是否完成</w:t>
             </w:r>
           </w:p>
         </w:tc>
@@ -4878,7 +4925,7 @@
               <w:rPr>
                 <w:sz w:val="18"/>
               </w:rPr>
-              <w:t>API Evidence 是否随报告提交完整明细</w:t>
+              <w:t>Partial Data 是否只展示部分可用部分缺失</w:t>
             </w:r>
           </w:p>
         </w:tc>
@@ -4907,7 +4954,7 @@
               <w:rPr>
                 <w:sz w:val="18"/>
               </w:rPr>
-              <w:t>Permission Evidence 是否随报告提交完整明细</w:t>
+              <w:t>API Evidence 是否在报告正文贴完整明细</w:t>
             </w:r>
           </w:p>
         </w:tc>
@@ -4936,7 +4983,7 @@
               <w:rPr>
                 <w:sz w:val="18"/>
               </w:rPr>
-              <w:t>是否接 OpenAI</w:t>
+              <w:t>Permission Evidence 是否在报告正文贴完整明细</w:t>
             </w:r>
           </w:p>
         </w:tc>
@@ -4950,7 +4997,7 @@
               <w:rPr>
                 <w:sz w:val="18"/>
               </w:rPr>
-              <w:t>否</w:t>
+              <w:t>是</w:t>
             </w:r>
           </w:p>
         </w:tc>
@@ -4965,7 +5012,7 @@
               <w:rPr>
                 <w:sz w:val="18"/>
               </w:rPr>
-              <w:t>是否伪造 LLM</w:t>
+              <w:t>Job Health closeup 是否补充</w:t>
             </w:r>
           </w:p>
         </w:tc>
@@ -4978,7 +5025,7 @@
               <w:rPr>
                 <w:sz w:val="18"/>
               </w:rPr>
-              <w:t>否</w:t>
+              <w:t>是</w:t>
             </w:r>
           </w:p>
         </w:tc>
@@ -4994,7 +5041,7 @@
               <w:rPr>
                 <w:sz w:val="18"/>
               </w:rPr>
-              <w:t>是否存在假 AI</w:t>
+              <w:t>Candidate Risk closeup 是否补充</w:t>
             </w:r>
           </w:p>
         </w:tc>
@@ -5008,7 +5055,7 @@
               <w:rPr>
                 <w:sz w:val="18"/>
               </w:rPr>
-              <w:t>否</w:t>
+              <w:t>是</w:t>
             </w:r>
           </w:p>
         </w:tc>
@@ -5023,7 +5070,7 @@
               <w:rPr>
                 <w:sz w:val="18"/>
               </w:rPr>
-              <w:t>是否自动决策</w:t>
+              <w:t>是否接 OpenAI</w:t>
             </w:r>
           </w:p>
         </w:tc>
@@ -5052,7 +5099,7 @@
               <w:rPr>
                 <w:sz w:val="18"/>
               </w:rPr>
-              <w:t>是否自动淘汰/录用</w:t>
+              <w:t>是否伪造 LLM</w:t>
             </w:r>
           </w:p>
         </w:tc>
@@ -5081,7 +5128,7 @@
               <w:rPr>
                 <w:sz w:val="18"/>
               </w:rPr>
-              <w:t>是否破坏 Action Center</w:t>
+              <w:t>是否存在假 AI</w:t>
             </w:r>
           </w:p>
         </w:tc>
@@ -5110,7 +5157,7 @@
               <w:rPr>
                 <w:sz w:val="18"/>
               </w:rPr>
-              <w:t>是否使用 mock 数据</w:t>
+              <w:t>是否自动决策</w:t>
             </w:r>
           </w:p>
         </w:tc>
@@ -5139,7 +5186,7 @@
               <w:rPr>
                 <w:sz w:val="18"/>
               </w:rPr>
-              <w:t>typecheck/lint/build 是否通过</w:t>
+              <w:t>是否自动淘汰/录用</w:t>
             </w:r>
           </w:p>
         </w:tc>
@@ -5152,7 +5199,7 @@
               <w:rPr>
                 <w:sz w:val="18"/>
               </w:rPr>
-              <w:t>是</w:t>
+              <w:t>否</w:t>
             </w:r>
           </w:p>
         </w:tc>
@@ -5168,7 +5215,7 @@
               <w:rPr>
                 <w:sz w:val="18"/>
               </w:rPr>
-              <w:t>git status 是否 clean</w:t>
+              <w:t>是否破坏 Action Center</w:t>
             </w:r>
           </w:p>
         </w:tc>
@@ -5182,7 +5229,7 @@
               <w:rPr>
                 <w:sz w:val="18"/>
               </w:rPr>
-              <w:t>是</w:t>
+              <w:t>否</w:t>
             </w:r>
           </w:p>
         </w:tc>
@@ -5197,7 +5244,7 @@
               <w:rPr>
                 <w:sz w:val="18"/>
               </w:rPr>
-              <w:t>是否合并 main</w:t>
+              <w:t>是否使用 mock 数据</w:t>
             </w:r>
           </w:p>
         </w:tc>
@@ -5226,7 +5273,7 @@
               <w:rPr>
                 <w:sz w:val="18"/>
               </w:rPr>
-              <w:t>是否 force push</w:t>
+              <w:t>typecheck/lint/build 是否通过</w:t>
             </w:r>
           </w:p>
         </w:tc>
@@ -5240,7 +5287,7 @@
               <w:rPr>
                 <w:sz w:val="18"/>
               </w:rPr>
-              <w:t>否</w:t>
+              <w:t>是</w:t>
             </w:r>
           </w:p>
         </w:tc>
@@ -5255,7 +5302,7 @@
               <w:rPr>
                 <w:sz w:val="18"/>
               </w:rPr>
-              <w:t>是否进入 Phase 8.2</w:t>
+              <w:t>git status 是否 clean</w:t>
             </w:r>
           </w:p>
         </w:tc>
@@ -5268,7 +5315,7 @@
               <w:rPr>
                 <w:sz w:val="18"/>
               </w:rPr>
-              <w:t>否</w:t>
+              <w:t>是</w:t>
             </w:r>
           </w:p>
         </w:tc>
@@ -5284,7 +5331,7 @@
               <w:rPr>
                 <w:sz w:val="18"/>
               </w:rPr>
-              <w:t>需要外部确认</w:t>
+              <w:t>是否合并 main</w:t>
             </w:r>
           </w:p>
         </w:tc>
@@ -5292,6 +5339,92 @@
           <w:tcPr>
             <w:tcW w:type="dxa" w:w="4320"/>
             <w:shd w:val="clear" w:color="auto" w:fill="F2F6FC"/>
+          </w:tcPr>
+          <w:p>
+            <w:r>
+              <w:rPr>
+                <w:sz w:val="18"/>
+              </w:rPr>
+              <w:t>否</w:t>
+            </w:r>
+          </w:p>
+        </w:tc>
+      </w:tr>
+      <w:tr>
+        <w:tc>
+          <w:tcPr>
+            <w:tcW w:type="dxa" w:w="4320"/>
+          </w:tcPr>
+          <w:p>
+            <w:r>
+              <w:rPr>
+                <w:sz w:val="18"/>
+              </w:rPr>
+              <w:t>是否 force push</w:t>
+            </w:r>
+          </w:p>
+        </w:tc>
+        <w:tc>
+          <w:tcPr>
+            <w:tcW w:type="dxa" w:w="4320"/>
+          </w:tcPr>
+          <w:p>
+            <w:r>
+              <w:rPr>
+                <w:sz w:val="18"/>
+              </w:rPr>
+              <w:t>否</w:t>
+            </w:r>
+          </w:p>
+        </w:tc>
+      </w:tr>
+      <w:tr>
+        <w:tc>
+          <w:tcPr>
+            <w:tcW w:type="dxa" w:w="4320"/>
+            <w:shd w:val="clear" w:color="auto" w:fill="F2F6FC"/>
+          </w:tcPr>
+          <w:p>
+            <w:r>
+              <w:rPr>
+                <w:sz w:val="18"/>
+              </w:rPr>
+              <w:t>是否进入 Phase 8.2</w:t>
+            </w:r>
+          </w:p>
+        </w:tc>
+        <w:tc>
+          <w:tcPr>
+            <w:tcW w:type="dxa" w:w="4320"/>
+            <w:shd w:val="clear" w:color="auto" w:fill="F2F6FC"/>
+          </w:tcPr>
+          <w:p>
+            <w:r>
+              <w:rPr>
+                <w:sz w:val="18"/>
+              </w:rPr>
+              <w:t>否</w:t>
+            </w:r>
+          </w:p>
+        </w:tc>
+      </w:tr>
+      <w:tr>
+        <w:tc>
+          <w:tcPr>
+            <w:tcW w:type="dxa" w:w="4320"/>
+          </w:tcPr>
+          <w:p>
+            <w:r>
+              <w:rPr>
+                <w:sz w:val="18"/>
+              </w:rPr>
+              <w:t>需要外部确认</w:t>
+            </w:r>
+          </w:p>
+        </w:tc>
+        <w:tc>
+          <w:tcPr>
+            <w:tcW w:type="dxa" w:w="4320"/>
           </w:tcPr>
           <w:p>
             <w:r>

</xml_diff>